<commit_message>
note the extension in the timing section
The instructor granted an extension, so the timing notes now say it does
not count against the student. No grade is added. No student code is modified.

Co-Authored-By: Claude Opus 5.5 <noreply@anthropic.com>
</commit_message>
<xml_diff>
--- a/Project 1/feedback/Chris-Sanchez-Project-1-Feedback.docx
+++ b/Project 1/feedback/Chris-Sanchez-Project-1-Feedback.docx
@@ -74,7 +74,7 @@
         </w:rPr>
         <w:t xml:space="preserve">Repo: </w:t>
       </w:r>
-      <w:hyperlink w:history="1" r:id="rIdkiwyqxalwwyunhz0p-njt">
+      <w:hyperlink w:history="1" r:id="rIdsjynldymygt0bqucyawsh">
         <w:r>
           <w:rPr>
             <w:rStyle w:val="Hyperlink"/>
@@ -92,7 +92,7 @@
         </w:rPr>
         <w:t xml:space="preserve">Live: </w:t>
       </w:r>
-      <w:hyperlink w:history="1" r:id="rIdsyz6tg6qiwtwiwcjztirq">
+      <w:hyperlink w:history="1" r:id="rIdm2r0wwsbtpndkion6hrky">
         <w:r>
           <w:rPr>
             <w:rStyle w:val="Hyperlink"/>
@@ -171,7 +171,7 @@
         <w:spacing w:after="120"/>
       </w:pPr>
       <w:r>
-        <w:t xml:space="preserve">One more thing, said plainly. On the September 15 deadline, Project 1/ held a 71-line page with a header, a hero and the marquee. The leader grid, the footer, the About page, all of the JavaScript and the Netlify deploy arrived between September 21 and October 3. Your instructor is handling the timing; this review grades the finished site.</w:t>
+        <w:t xml:space="preserve">One more thing, said plainly. On the September 15 deadline, Project 1/ held a 71-line page with a header, a hero and the marquee. The leader grid, the footer, the About page, all of the JavaScript and the Netlify deploy arrived between September 21 and October 3. You had an extension, so the timing does not count against you; this review grades the finished site.</w:t>
       </w:r>
     </w:p>
     <w:p>
@@ -2021,10 +2021,10 @@
           <w:b/>
           <w:bCs/>
         </w:rPr>
-        <w:t xml:space="preserve">The timing. </w:t>
-      </w:r>
-      <w:r>
-        <w:t xml:space="preserve">On September 15 the folder held the header, the hero and the marquee. The leader grid, footer, About page, script and deploy came between September 21 and October 3. Your instructor is handling that separately. For Project 2, the habit to build is shipping a working core by the deadline and polishing afterward.</w:t>
+        <w:t xml:space="preserve">The timing, for the record. </w:t>
+      </w:r>
+      <w:r>
+        <w:t xml:space="preserve">On September 15 the folder held the header, the hero and the marquee. The leader grid, footer, About page, script and deploy came between September 21 and October 3. You had an extension, so this costs nothing. For Project 2, the habit to build is still shipping a working core early and polishing afterward.</w:t>
       </w:r>
     </w:p>
     <w:p>

</xml_diff>